<commit_message>
Add equations, conductivity record and Monte Carlo error figures to sampling plan document
</commit_message>
<xml_diff>
--- a/docs/outreach/sampling_plan_costs.docx
+++ b/docs/outreach/sampling_plan_costs.docx
@@ -1504,6 +1504,2021 @@
       </w:r>
     </w:p>
     <w:bookmarkEnd w:id="11"/>
+    <w:bookmarkStart w:id="12" w:name="Xc7e4396fc8126939036c328ee208ae9e334805d"/>
+    <w:p>
+      <w:pPr>
+        <w:pStyle w:val="Heading2"/>
+      </w:pPr>
+      <w:r>
+        <w:t xml:space="preserve">Equations used for the conductance proxy, model fitting and sampling-error test</w:t>
+      </w:r>
+    </w:p>
+    <w:p>
+      <w:pPr>
+        <w:pStyle w:val="FirstParagraph"/>
+      </w:pPr>
+      <w:r>
+        <w:rPr>
+          <w:b/>
+          <w:bCs/>
+        </w:rPr>
+        <w:t xml:space="preserve">1. Specific conductance from logger conductivity.</w:t>
+      </w:r>
+      <w:r>
+        <w:t xml:space="preserve"> </w:t>
+      </w:r>
+      <w:r>
+        <w:t xml:space="preserve">The loggers record raw electrical conductivity</w:t>
+      </w:r>
+      <w:r>
+        <w:t xml:space="preserve"> </w:t>
+      </w:r>
+      <m:oMath>
+        <m:r>
+          <m:t>E</m:t>
+        </m:r>
+        <m:r>
+          <m:t>C</m:t>
+        </m:r>
+      </m:oMath>
+      <w:r>
+        <w:t xml:space="preserve"> </w:t>
+      </w:r>
+      <w:r>
+        <w:t xml:space="preserve">at water temperature</w:t>
+      </w:r>
+      <w:r>
+        <w:t xml:space="preserve"> </w:t>
+      </w:r>
+      <m:oMath>
+        <m:r>
+          <m:t>T</m:t>
+        </m:r>
+      </m:oMath>
+      <w:r>
+        <w:t xml:space="preserve"> </w:t>
+      </w:r>
+      <w:r>
+        <w:t xml:space="preserve">(degrees C). I remove the temperature effect with the USGS non-linear compensation (coefficient</w:t>
+      </w:r>
+      <w:r>
+        <w:t xml:space="preserve"> </w:t>
+      </w:r>
+      <m:oMath>
+        <m:r>
+          <m:t>a</m:t>
+        </m:r>
+        <m:r>
+          <m:rPr>
+            <m:sty m:val="p"/>
+          </m:rPr>
+          <m:t>=</m:t>
+        </m:r>
+        <m:r>
+          <m:t>0.0191</m:t>
+        </m:r>
+      </m:oMath>
+      <w:r>
+        <w:t xml:space="preserve"> </w:t>
+      </w:r>
+      <w:r>
+        <w:t xml:space="preserve">per degree C, to be recalibrated against field checks):</w:t>
+      </w:r>
+    </w:p>
+    <w:p>
+      <w:pPr>
+        <w:pStyle w:val="BodyText"/>
+      </w:pPr>
+      <m:oMathPara>
+        <m:oMathParaPr>
+          <m:jc m:val="center"/>
+        </m:oMathParaPr>
+        <m:oMath>
+          <m:r>
+            <m:t>S</m:t>
+          </m:r>
+          <m:sSub>
+            <m:e>
+              <m:r>
+                <m:t>C</m:t>
+              </m:r>
+            </m:e>
+            <m:sub>
+              <m:r>
+                <m:t>25</m:t>
+              </m:r>
+            </m:sub>
+          </m:sSub>
+          <m:r>
+            <m:rPr>
+              <m:sty m:val="p"/>
+            </m:rPr>
+            <m:t>=</m:t>
+          </m:r>
+          <m:f>
+            <m:fPr>
+              <m:type m:val="bar"/>
+            </m:fPr>
+            <m:num>
+              <m:r>
+                <m:t>E</m:t>
+              </m:r>
+              <m:r>
+                <m:t>C</m:t>
+              </m:r>
+            </m:num>
+            <m:den>
+              <m:r>
+                <m:t>1</m:t>
+              </m:r>
+              <m:r>
+                <m:rPr>
+                  <m:sty m:val="p"/>
+                </m:rPr>
+                <m:t>+</m:t>
+              </m:r>
+              <m:r>
+                <m:t>a</m:t>
+              </m:r>
+              <m:r>
+                <m:t> </m:t>
+              </m:r>
+              <m:r>
+                <m:rPr>
+                  <m:sty m:val="p"/>
+                </m:rPr>
+                <m:t>(</m:t>
+              </m:r>
+              <m:r>
+                <m:t>T</m:t>
+              </m:r>
+              <m:r>
+                <m:rPr>
+                  <m:sty m:val="p"/>
+                </m:rPr>
+                <m:t>−</m:t>
+              </m:r>
+              <m:r>
+                <m:t>25</m:t>
+              </m:r>
+              <m:r>
+                <m:rPr>
+                  <m:sty m:val="p"/>
+                </m:rPr>
+                <m:t>)</m:t>
+              </m:r>
+            </m:den>
+          </m:f>
+        </m:oMath>
+      </m:oMathPara>
+    </w:p>
+    <w:p>
+      <w:pPr>
+        <w:pStyle w:val="FirstParagraph"/>
+      </w:pPr>
+      <w:r>
+        <w:rPr>
+          <w:b/>
+          <w:bCs/>
+        </w:rPr>
+        <w:t xml:space="preserve">2. Chloride from specific conductance (the proxy).</w:t>
+      </w:r>
+      <w:r>
+        <w:t xml:space="preserve"> </w:t>
+      </w:r>
+      <w:r>
+        <w:t xml:space="preserve">Chloride is the conservative tracer of thermal water, and in this system conductance tracks chloride because chloride and sodium dominate the thermal fluid. The simplest model is a linear regression, fitted to paired samples:</w:t>
+      </w:r>
+    </w:p>
+    <w:p>
+      <w:pPr>
+        <w:pStyle w:val="BodyText"/>
+      </w:pPr>
+      <m:oMathPara>
+        <m:oMathParaPr>
+          <m:jc m:val="center"/>
+        </m:oMathParaPr>
+        <m:oMath>
+          <m:sSub>
+            <m:e>
+              <m:r>
+                <m:rPr>
+                  <m:sty m:val="p"/>
+                </m:rPr>
+                <m:t>C</m:t>
+              </m:r>
+              <m:r>
+                <m:rPr>
+                  <m:sty m:val="p"/>
+                </m:rPr>
+                <m:t>l</m:t>
+              </m:r>
+            </m:e>
+            <m:sub>
+              <m:r>
+                <m:t>t</m:t>
+              </m:r>
+            </m:sub>
+          </m:sSub>
+          <m:r>
+            <m:rPr>
+              <m:sty m:val="p"/>
+            </m:rPr>
+            <m:t>=</m:t>
+          </m:r>
+          <m:sSub>
+            <m:e>
+              <m:r>
+                <m:t>β</m:t>
+              </m:r>
+            </m:e>
+            <m:sub>
+              <m:r>
+                <m:t>0</m:t>
+              </m:r>
+            </m:sub>
+          </m:sSub>
+          <m:r>
+            <m:rPr>
+              <m:sty m:val="p"/>
+            </m:rPr>
+            <m:t>+</m:t>
+          </m:r>
+          <m:sSub>
+            <m:e>
+              <m:r>
+                <m:t>β</m:t>
+              </m:r>
+            </m:e>
+            <m:sub>
+              <m:r>
+                <m:t>1</m:t>
+              </m:r>
+            </m:sub>
+          </m:sSub>
+          <m:r>
+            <m:t> </m:t>
+          </m:r>
+          <m:r>
+            <m:t>S</m:t>
+          </m:r>
+          <m:sSub>
+            <m:e>
+              <m:r>
+                <m:t>C</m:t>
+              </m:r>
+            </m:e>
+            <m:sub>
+              <m:r>
+                <m:t>25</m:t>
+              </m:r>
+              <m:r>
+                <m:rPr>
+                  <m:sty m:val="p"/>
+                </m:rPr>
+                <m:t>,</m:t>
+              </m:r>
+              <m:r>
+                <m:t>t</m:t>
+              </m:r>
+            </m:sub>
+          </m:sSub>
+          <m:r>
+            <m:rPr>
+              <m:sty m:val="p"/>
+            </m:rPr>
+            <m:t>+</m:t>
+          </m:r>
+          <m:sSub>
+            <m:e>
+              <m:r>
+                <m:t>ε</m:t>
+              </m:r>
+            </m:e>
+            <m:sub>
+              <m:r>
+                <m:t>t</m:t>
+              </m:r>
+            </m:sub>
+          </m:sSub>
+        </m:oMath>
+      </m:oMathPara>
+    </w:p>
+    <w:p>
+      <w:pPr>
+        <w:pStyle w:val="FirstParagraph"/>
+      </w:pPr>
+      <w:r>
+        <w:t xml:space="preserve">The generalized additive model (GAM) adds smooth terms for conductance and temperature and a seasonal harmonic (</w:t>
+      </w:r>
+      <m:oMath>
+        <m:r>
+          <m:t>d</m:t>
+        </m:r>
+      </m:oMath>
+      <w:r>
+        <w:t xml:space="preserve"> </w:t>
+      </w:r>
+      <w:r>
+        <w:t xml:space="preserve">is day of year; splines with</w:t>
+      </w:r>
+      <w:r>
+        <w:t xml:space="preserve"> </w:t>
+      </w:r>
+      <m:oMath>
+        <m:r>
+          <m:t>k</m:t>
+        </m:r>
+        <m:r>
+          <m:rPr>
+            <m:sty m:val="p"/>
+          </m:rPr>
+          <m:t>=</m:t>
+        </m:r>
+        <m:r>
+          <m:t>4</m:t>
+        </m:r>
+      </m:oMath>
+      <w:r>
+        <w:t xml:space="preserve">):</w:t>
+      </w:r>
+    </w:p>
+    <w:p>
+      <w:pPr>
+        <w:pStyle w:val="BodyText"/>
+      </w:pPr>
+      <m:oMathPara>
+        <m:oMathParaPr>
+          <m:jc m:val="center"/>
+        </m:oMathParaPr>
+        <m:oMath>
+          <m:sSub>
+            <m:e>
+              <m:r>
+                <m:rPr>
+                  <m:sty m:val="p"/>
+                </m:rPr>
+                <m:t>C</m:t>
+              </m:r>
+              <m:r>
+                <m:rPr>
+                  <m:sty m:val="p"/>
+                </m:rPr>
+                <m:t>l</m:t>
+              </m:r>
+            </m:e>
+            <m:sub>
+              <m:r>
+                <m:t>t</m:t>
+              </m:r>
+            </m:sub>
+          </m:sSub>
+          <m:r>
+            <m:rPr>
+              <m:sty m:val="p"/>
+            </m:rPr>
+            <m:t>=</m:t>
+          </m:r>
+          <m:sSub>
+            <m:e>
+              <m:r>
+                <m:t>β</m:t>
+              </m:r>
+            </m:e>
+            <m:sub>
+              <m:r>
+                <m:t>0</m:t>
+              </m:r>
+            </m:sub>
+          </m:sSub>
+          <m:r>
+            <m:rPr>
+              <m:sty m:val="p"/>
+            </m:rPr>
+            <m:t>+</m:t>
+          </m:r>
+          <m:sSub>
+            <m:e>
+              <m:r>
+                <m:t>f</m:t>
+              </m:r>
+            </m:e>
+            <m:sub>
+              <m:r>
+                <m:t>1</m:t>
+              </m:r>
+            </m:sub>
+          </m:sSub>
+          <m:r>
+            <m:rPr>
+              <m:sty m:val="p"/>
+            </m:rPr>
+            <m:t>(</m:t>
+          </m:r>
+          <m:r>
+            <m:t>S</m:t>
+          </m:r>
+          <m:sSub>
+            <m:e>
+              <m:r>
+                <m:t>C</m:t>
+              </m:r>
+            </m:e>
+            <m:sub>
+              <m:r>
+                <m:t>25</m:t>
+              </m:r>
+              <m:r>
+                <m:rPr>
+                  <m:sty m:val="p"/>
+                </m:rPr>
+                <m:t>,</m:t>
+              </m:r>
+              <m:r>
+                <m:t>t</m:t>
+              </m:r>
+            </m:sub>
+          </m:sSub>
+          <m:r>
+            <m:rPr>
+              <m:sty m:val="p"/>
+            </m:rPr>
+            <m:t>)</m:t>
+          </m:r>
+          <m:r>
+            <m:rPr>
+              <m:sty m:val="p"/>
+            </m:rPr>
+            <m:t>+</m:t>
+          </m:r>
+          <m:sSub>
+            <m:e>
+              <m:r>
+                <m:t>f</m:t>
+              </m:r>
+            </m:e>
+            <m:sub>
+              <m:r>
+                <m:t>2</m:t>
+              </m:r>
+            </m:sub>
+          </m:sSub>
+          <m:r>
+            <m:rPr>
+              <m:sty m:val="p"/>
+            </m:rPr>
+            <m:t>(</m:t>
+          </m:r>
+          <m:sSub>
+            <m:e>
+              <m:r>
+                <m:t>T</m:t>
+              </m:r>
+            </m:e>
+            <m:sub>
+              <m:r>
+                <m:t>t</m:t>
+              </m:r>
+            </m:sub>
+          </m:sSub>
+          <m:r>
+            <m:rPr>
+              <m:sty m:val="p"/>
+            </m:rPr>
+            <m:t>)</m:t>
+          </m:r>
+          <m:r>
+            <m:rPr>
+              <m:sty m:val="p"/>
+            </m:rPr>
+            <m:t>+</m:t>
+          </m:r>
+          <m:sSub>
+            <m:e>
+              <m:r>
+                <m:t>β</m:t>
+              </m:r>
+            </m:e>
+            <m:sub>
+              <m:r>
+                <m:t>3</m:t>
+              </m:r>
+            </m:sub>
+          </m:sSub>
+          <m:r>
+            <m:rPr>
+              <m:sty m:val="p"/>
+            </m:rPr>
+            <m:t>sin</m:t>
+          </m:r>
+          <m:r>
+            <m:t>​</m:t>
+          </m:r>
+          <m:d>
+            <m:dPr>
+              <m:begChr m:val="("/>
+              <m:sepChr m:val=""/>
+              <m:endChr m:val=")"/>
+              <m:grow/>
+            </m:dPr>
+            <m:e>
+              <m:f>
+                <m:fPr>
+                  <m:type m:val="lin"/>
+                </m:fPr>
+                <m:num>
+                  <m:r>
+                    <m:t>2</m:t>
+                  </m:r>
+                  <m:r>
+                    <m:t>π</m:t>
+                  </m:r>
+                  <m:sSub>
+                    <m:e>
+                      <m:r>
+                        <m:t>d</m:t>
+                      </m:r>
+                    </m:e>
+                    <m:sub>
+                      <m:r>
+                        <m:t>t</m:t>
+                      </m:r>
+                    </m:sub>
+                  </m:sSub>
+                </m:num>
+                <m:den>
+                  <m:r>
+                    <m:t>365</m:t>
+                  </m:r>
+                </m:den>
+              </m:f>
+            </m:e>
+          </m:d>
+          <m:r>
+            <m:rPr>
+              <m:sty m:val="p"/>
+            </m:rPr>
+            <m:t>+</m:t>
+          </m:r>
+          <m:sSub>
+            <m:e>
+              <m:r>
+                <m:t>β</m:t>
+              </m:r>
+            </m:e>
+            <m:sub>
+              <m:r>
+                <m:t>4</m:t>
+              </m:r>
+            </m:sub>
+          </m:sSub>
+          <m:r>
+            <m:rPr>
+              <m:sty m:val="p"/>
+            </m:rPr>
+            <m:t>cos</m:t>
+          </m:r>
+          <m:r>
+            <m:t>​</m:t>
+          </m:r>
+          <m:d>
+            <m:dPr>
+              <m:begChr m:val="("/>
+              <m:sepChr m:val=""/>
+              <m:endChr m:val=")"/>
+              <m:grow/>
+            </m:dPr>
+            <m:e>
+              <m:f>
+                <m:fPr>
+                  <m:type m:val="lin"/>
+                </m:fPr>
+                <m:num>
+                  <m:r>
+                    <m:t>2</m:t>
+                  </m:r>
+                  <m:r>
+                    <m:t>π</m:t>
+                  </m:r>
+                  <m:sSub>
+                    <m:e>
+                      <m:r>
+                        <m:t>d</m:t>
+                      </m:r>
+                    </m:e>
+                    <m:sub>
+                      <m:r>
+                        <m:t>t</m:t>
+                      </m:r>
+                    </m:sub>
+                  </m:sSub>
+                </m:num>
+                <m:den>
+                  <m:r>
+                    <m:t>365</m:t>
+                  </m:r>
+                </m:den>
+              </m:f>
+            </m:e>
+          </m:d>
+          <m:r>
+            <m:rPr>
+              <m:sty m:val="p"/>
+            </m:rPr>
+            <m:t>+</m:t>
+          </m:r>
+          <m:sSub>
+            <m:e>
+              <m:r>
+                <m:t>ε</m:t>
+              </m:r>
+            </m:e>
+            <m:sub>
+              <m:r>
+                <m:t>t</m:t>
+              </m:r>
+            </m:sub>
+          </m:sSub>
+        </m:oMath>
+      </m:oMathPara>
+    </w:p>
+    <w:p>
+      <w:pPr>
+        <w:pStyle w:val="FirstParagraph"/>
+      </w:pPr>
+      <w:r>
+        <w:t xml:space="preserve">A random forest on the same predictors is the skill benchmark. Models are scored with rolling-origin (blocked, time-aware) cross-validation: each fold trains on all samples up to time</w:t>
+      </w:r>
+      <w:r>
+        <w:t xml:space="preserve"> </w:t>
+      </w:r>
+      <m:oMath>
+        <m:sSub>
+          <m:e>
+            <m:r>
+              <m:t>t</m:t>
+            </m:r>
+          </m:e>
+          <m:sub>
+            <m:r>
+              <m:t>k</m:t>
+            </m:r>
+          </m:sub>
+        </m:sSub>
+      </m:oMath>
+      <w:r>
+        <w:t xml:space="preserve"> </w:t>
+      </w:r>
+      <w:r>
+        <w:t xml:space="preserve">and predicts the next block, so autocorrelation cannot inflate skill:</w:t>
+      </w:r>
+    </w:p>
+    <w:p>
+      <w:pPr>
+        <w:pStyle w:val="BodyText"/>
+      </w:pPr>
+      <m:oMathPara>
+        <m:oMathParaPr>
+          <m:jc m:val="center"/>
+        </m:oMathParaPr>
+        <m:oMath>
+          <m:r>
+            <m:rPr>
+              <m:sty m:val="p"/>
+            </m:rPr>
+            <m:t>R</m:t>
+          </m:r>
+          <m:r>
+            <m:rPr>
+              <m:sty m:val="p"/>
+            </m:rPr>
+            <m:t>M</m:t>
+          </m:r>
+          <m:r>
+            <m:rPr>
+              <m:sty m:val="p"/>
+            </m:rPr>
+            <m:t>S</m:t>
+          </m:r>
+          <m:r>
+            <m:rPr>
+              <m:sty m:val="p"/>
+            </m:rPr>
+            <m:t>E</m:t>
+          </m:r>
+          <m:r>
+            <m:rPr>
+              <m:sty m:val="p"/>
+            </m:rPr>
+            <m:t>=</m:t>
+          </m:r>
+          <m:rad>
+            <m:radPr>
+              <m:degHide m:val="on"/>
+            </m:radPr>
+            <m:deg/>
+            <m:e>
+              <m:f>
+                <m:fPr>
+                  <m:type m:val="bar"/>
+                </m:fPr>
+                <m:num>
+                  <m:r>
+                    <m:t>1</m:t>
+                  </m:r>
+                </m:num>
+                <m:den>
+                  <m:r>
+                    <m:t>n</m:t>
+                  </m:r>
+                </m:den>
+              </m:f>
+              <m:nary>
+                <m:naryPr>
+                  <m:chr m:val="∑"/>
+                  <m:limLoc m:val="undOvr"/>
+                  <m:subHide m:val="off"/>
+                  <m:supHide m:val="off"/>
+                </m:naryPr>
+                <m:sub>
+                  <m:r>
+                    <m:t>i</m:t>
+                  </m:r>
+                  <m:r>
+                    <m:rPr>
+                      <m:sty m:val="p"/>
+                    </m:rPr>
+                    <m:t>=</m:t>
+                  </m:r>
+                  <m:r>
+                    <m:t>1</m:t>
+                  </m:r>
+                </m:sub>
+                <m:sup>
+                  <m:r>
+                    <m:t>n</m:t>
+                  </m:r>
+                </m:sup>
+                <m:e>
+                  <m:sSup>
+                    <m:e>
+                      <m:d>
+                        <m:dPr>
+                          <m:begChr m:val="("/>
+                          <m:sepChr m:val=""/>
+                          <m:endChr m:val=")"/>
+                          <m:grow/>
+                        </m:dPr>
+                        <m:e>
+                          <m:sSub>
+                            <m:e>
+                              <m:r>
+                                <m:rPr>
+                                  <m:sty m:val="p"/>
+                                </m:rPr>
+                                <m:t>C</m:t>
+                              </m:r>
+                              <m:r>
+                                <m:rPr>
+                                  <m:sty m:val="p"/>
+                                </m:rPr>
+                                <m:t>l</m:t>
+                              </m:r>
+                            </m:e>
+                            <m:sub>
+                              <m:r>
+                                <m:t>i</m:t>
+                              </m:r>
+                            </m:sub>
+                          </m:sSub>
+                          <m:r>
+                            <m:rPr>
+                              <m:sty m:val="p"/>
+                            </m:rPr>
+                            <m:t>−</m:t>
+                          </m:r>
+                          <m:sSub>
+                            <m:e>
+                              <m:acc>
+                                <m:accPr>
+                                  <m:chr m:val="̂"/>
+                                </m:accPr>
+                                <m:e>
+                                  <m:r>
+                                    <m:rPr>
+                                      <m:sty m:val="p"/>
+                                    </m:rPr>
+                                    <m:t>C</m:t>
+                                  </m:r>
+                                  <m:r>
+                                    <m:rPr>
+                                      <m:sty m:val="p"/>
+                                    </m:rPr>
+                                    <m:t>l</m:t>
+                                  </m:r>
+                                </m:e>
+                              </m:acc>
+                            </m:e>
+                            <m:sub>
+                              <m:r>
+                                <m:t>i</m:t>
+                              </m:r>
+                            </m:sub>
+                          </m:sSub>
+                        </m:e>
+                      </m:d>
+                    </m:e>
+                    <m:sup>
+                      <m:r>
+                        <m:t>2</m:t>
+                      </m:r>
+                    </m:sup>
+                  </m:sSup>
+                </m:e>
+              </m:nary>
+            </m:e>
+          </m:rad>
+        </m:oMath>
+      </m:oMathPara>
+    </w:p>
+    <w:p>
+      <w:pPr>
+        <w:pStyle w:val="FirstParagraph"/>
+      </w:pPr>
+      <w:r>
+        <w:rPr>
+          <w:b/>
+          <w:bCs/>
+        </w:rPr>
+        <w:t xml:space="preserve">3. Monte Carlo sampling-interval test.</w:t>
+      </w:r>
+      <w:r>
+        <w:t xml:space="preserve"> </w:t>
+      </w:r>
+      <w:r>
+        <w:t xml:space="preserve">For a candidate sampling interval of</w:t>
+      </w:r>
+      <w:r>
+        <w:t xml:space="preserve"> </w:t>
+      </w:r>
+      <m:oMath>
+        <m:r>
+          <m:t>f</m:t>
+        </m:r>
+      </m:oMath>
+      <w:r>
+        <w:t xml:space="preserve"> </w:t>
+      </w:r>
+      <w:r>
+        <w:t xml:space="preserve">days and a logger step of</w:t>
+      </w:r>
+      <w:r>
+        <w:t xml:space="preserve"> </w:t>
+      </w:r>
+      <m:oMath>
+        <m:r>
+          <m:rPr>
+            <m:sty m:val="p"/>
+          </m:rPr>
+          <m:t>Δ</m:t>
+        </m:r>
+        <m:r>
+          <m:t>t</m:t>
+        </m:r>
+      </m:oMath>
+      <w:r>
+        <w:t xml:space="preserve"> </w:t>
+      </w:r>
+      <w:r>
+        <w:t xml:space="preserve">minutes, the number of logger steps between samples is</w:t>
+      </w:r>
+      <w:r>
+        <w:t xml:space="preserve"> </w:t>
+      </w:r>
+      <m:oMath>
+        <m:sSub>
+          <m:e>
+            <m:r>
+              <m:t>n</m:t>
+            </m:r>
+          </m:e>
+          <m:sub>
+            <m:r>
+              <m:t>f</m:t>
+            </m:r>
+          </m:sub>
+        </m:sSub>
+        <m:r>
+          <m:rPr>
+            <m:sty m:val="p"/>
+          </m:rPr>
+          <m:t>=</m:t>
+        </m:r>
+        <m:r>
+          <m:t>f</m:t>
+        </m:r>
+        <m:r>
+          <m:rPr>
+            <m:sty m:val="p"/>
+          </m:rPr>
+          <m:t>⋅</m:t>
+        </m:r>
+        <m:r>
+          <m:t>1440</m:t>
+        </m:r>
+        <m:r>
+          <m:rPr>
+            <m:sty m:val="p"/>
+          </m:rPr>
+          <m:t>/</m:t>
+        </m:r>
+        <m:r>
+          <m:rPr>
+            <m:sty m:val="p"/>
+          </m:rPr>
+          <m:t>Δ</m:t>
+        </m:r>
+        <m:r>
+          <m:t>t</m:t>
+        </m:r>
+      </m:oMath>
+      <w:r>
+        <w:t xml:space="preserve">. For draw</w:t>
+      </w:r>
+      <w:r>
+        <w:t xml:space="preserve"> </w:t>
+      </w:r>
+      <m:oMath>
+        <m:r>
+          <m:t>j</m:t>
+        </m:r>
+        <m:r>
+          <m:rPr>
+            <m:sty m:val="p"/>
+          </m:rPr>
+          <m:t>=</m:t>
+        </m:r>
+        <m:r>
+          <m:t>1</m:t>
+        </m:r>
+        <m:r>
+          <m:rPr>
+            <m:sty m:val="p"/>
+          </m:rPr>
+          <m:t>,</m:t>
+        </m:r>
+        <m:r>
+          <m:rPr>
+            <m:sty m:val="p"/>
+          </m:rPr>
+          <m:t>…</m:t>
+        </m:r>
+        <m:r>
+          <m:rPr>
+            <m:sty m:val="p"/>
+          </m:rPr>
+          <m:t>,</m:t>
+        </m:r>
+        <m:r>
+          <m:t>200</m:t>
+        </m:r>
+      </m:oMath>
+      <w:r>
+        <w:t xml:space="preserve"> </w:t>
+      </w:r>
+      <w:r>
+        <w:t xml:space="preserve">a random start offset</w:t>
+      </w:r>
+      <w:r>
+        <w:t xml:space="preserve"> </w:t>
+      </w:r>
+      <m:oMath>
+        <m:sSub>
+          <m:e>
+            <m:r>
+              <m:t>o</m:t>
+            </m:r>
+          </m:e>
+          <m:sub>
+            <m:r>
+              <m:t>j</m:t>
+            </m:r>
+          </m:sub>
+        </m:sSub>
+        <m:r>
+          <m:rPr>
+            <m:sty m:val="p"/>
+          </m:rPr>
+          <m:t>∼</m:t>
+        </m:r>
+        <m:r>
+          <m:rPr>
+            <m:sty m:val="p"/>
+          </m:rPr>
+          <m:t>U</m:t>
+        </m:r>
+        <m:r>
+          <m:rPr>
+            <m:sty m:val="p"/>
+          </m:rPr>
+          <m:t>{</m:t>
+        </m:r>
+        <m:r>
+          <m:t>1</m:t>
+        </m:r>
+        <m:r>
+          <m:rPr>
+            <m:sty m:val="p"/>
+          </m:rPr>
+          <m:t>,</m:t>
+        </m:r>
+        <m:r>
+          <m:rPr>
+            <m:sty m:val="p"/>
+          </m:rPr>
+          <m:t>…</m:t>
+        </m:r>
+        <m:r>
+          <m:rPr>
+            <m:sty m:val="p"/>
+          </m:rPr>
+          <m:t>,</m:t>
+        </m:r>
+        <m:sSub>
+          <m:e>
+            <m:r>
+              <m:t>n</m:t>
+            </m:r>
+          </m:e>
+          <m:sub>
+            <m:r>
+              <m:t>f</m:t>
+            </m:r>
+          </m:sub>
+        </m:sSub>
+        <m:r>
+          <m:rPr>
+            <m:sty m:val="p"/>
+          </m:rPr>
+          <m:t>}</m:t>
+        </m:r>
+      </m:oMath>
+      <w:r>
+        <w:t xml:space="preserve"> </w:t>
+      </w:r>
+      <w:r>
+        <w:t xml:space="preserve">selects samples at steps</w:t>
+      </w:r>
+      <w:r>
+        <w:t xml:space="preserve"> </w:t>
+      </w:r>
+      <m:oMath>
+        <m:sSub>
+          <m:e>
+            <m:r>
+              <m:t>o</m:t>
+            </m:r>
+          </m:e>
+          <m:sub>
+            <m:r>
+              <m:t>j</m:t>
+            </m:r>
+          </m:sub>
+        </m:sSub>
+        <m:r>
+          <m:rPr>
+            <m:sty m:val="p"/>
+          </m:rPr>
+          <m:t>,</m:t>
+        </m:r>
+        <m:sSub>
+          <m:e>
+            <m:r>
+              <m:t>o</m:t>
+            </m:r>
+          </m:e>
+          <m:sub>
+            <m:r>
+              <m:t>j</m:t>
+            </m:r>
+          </m:sub>
+        </m:sSub>
+        <m:r>
+          <m:rPr>
+            <m:sty m:val="p"/>
+          </m:rPr>
+          <m:t>+</m:t>
+        </m:r>
+        <m:sSub>
+          <m:e>
+            <m:r>
+              <m:t>n</m:t>
+            </m:r>
+          </m:e>
+          <m:sub>
+            <m:r>
+              <m:t>f</m:t>
+            </m:r>
+          </m:sub>
+        </m:sSub>
+        <m:r>
+          <m:rPr>
+            <m:sty m:val="p"/>
+          </m:rPr>
+          <m:t>,</m:t>
+        </m:r>
+        <m:sSub>
+          <m:e>
+            <m:r>
+              <m:t>o</m:t>
+            </m:r>
+          </m:e>
+          <m:sub>
+            <m:r>
+              <m:t>j</m:t>
+            </m:r>
+          </m:sub>
+        </m:sSub>
+        <m:r>
+          <m:rPr>
+            <m:sty m:val="p"/>
+          </m:rPr>
+          <m:t>+</m:t>
+        </m:r>
+        <m:r>
+          <m:t>2</m:t>
+        </m:r>
+        <m:sSub>
+          <m:e>
+            <m:r>
+              <m:t>n</m:t>
+            </m:r>
+          </m:e>
+          <m:sub>
+            <m:r>
+              <m:t>f</m:t>
+            </m:r>
+          </m:sub>
+        </m:sSub>
+        <m:r>
+          <m:rPr>
+            <m:sty m:val="p"/>
+          </m:rPr>
+          <m:t>,</m:t>
+        </m:r>
+        <m:r>
+          <m:rPr>
+            <m:sty m:val="p"/>
+          </m:rPr>
+          <m:t>…</m:t>
+        </m:r>
+      </m:oMath>
+      <w:r>
+        <w:t xml:space="preserve">. The full series is rebuilt by linear interpolation between those samples, and the error against the dense record</w:t>
+      </w:r>
+      <w:r>
+        <w:t xml:space="preserve"> </w:t>
+      </w:r>
+      <m:oMath>
+        <m:sSub>
+          <m:e>
+            <m:r>
+              <m:t>y</m:t>
+            </m:r>
+          </m:e>
+          <m:sub>
+            <m:r>
+              <m:t>t</m:t>
+            </m:r>
+          </m:sub>
+        </m:sSub>
+      </m:oMath>
+      <w:r>
+        <w:t xml:space="preserve"> </w:t>
+      </w:r>
+      <w:r>
+        <w:t xml:space="preserve">is</w:t>
+      </w:r>
+    </w:p>
+    <w:p>
+      <w:pPr>
+        <w:pStyle w:val="BodyText"/>
+      </w:pPr>
+      <m:oMathPara>
+        <m:oMathParaPr>
+          <m:jc m:val="center"/>
+        </m:oMathParaPr>
+        <m:oMath>
+          <m:sSub>
+            <m:e>
+              <m:r>
+                <m:rPr>
+                  <m:sty m:val="p"/>
+                </m:rPr>
+                <m:t>R</m:t>
+              </m:r>
+              <m:r>
+                <m:rPr>
+                  <m:sty m:val="p"/>
+                </m:rPr>
+                <m:t>M</m:t>
+              </m:r>
+              <m:r>
+                <m:rPr>
+                  <m:sty m:val="p"/>
+                </m:rPr>
+                <m:t>S</m:t>
+              </m:r>
+              <m:r>
+                <m:rPr>
+                  <m:sty m:val="p"/>
+                </m:rPr>
+                <m:t>E</m:t>
+              </m:r>
+            </m:e>
+            <m:sub>
+              <m:r>
+                <m:t>f</m:t>
+              </m:r>
+              <m:r>
+                <m:rPr>
+                  <m:sty m:val="p"/>
+                </m:rPr>
+                <m:t>,</m:t>
+              </m:r>
+              <m:r>
+                <m:t>j</m:t>
+              </m:r>
+            </m:sub>
+          </m:sSub>
+          <m:r>
+            <m:rPr>
+              <m:sty m:val="p"/>
+            </m:rPr>
+            <m:t>=</m:t>
+          </m:r>
+          <m:rad>
+            <m:radPr>
+              <m:degHide m:val="on"/>
+            </m:radPr>
+            <m:deg/>
+            <m:e>
+              <m:f>
+                <m:fPr>
+                  <m:type m:val="bar"/>
+                </m:fPr>
+                <m:num>
+                  <m:r>
+                    <m:t>1</m:t>
+                  </m:r>
+                </m:num>
+                <m:den>
+                  <m:r>
+                    <m:t>N</m:t>
+                  </m:r>
+                </m:den>
+              </m:f>
+              <m:nary>
+                <m:naryPr>
+                  <m:chr m:val="∑"/>
+                  <m:limLoc m:val="undOvr"/>
+                  <m:subHide m:val="off"/>
+                  <m:supHide m:val="off"/>
+                </m:naryPr>
+                <m:sub>
+                  <m:r>
+                    <m:t>t</m:t>
+                  </m:r>
+                  <m:r>
+                    <m:rPr>
+                      <m:sty m:val="p"/>
+                    </m:rPr>
+                    <m:t>=</m:t>
+                  </m:r>
+                  <m:r>
+                    <m:t>1</m:t>
+                  </m:r>
+                </m:sub>
+                <m:sup>
+                  <m:r>
+                    <m:t>N</m:t>
+                  </m:r>
+                </m:sup>
+                <m:e>
+                  <m:sSup>
+                    <m:e>
+                      <m:d>
+                        <m:dPr>
+                          <m:begChr m:val="("/>
+                          <m:sepChr m:val=""/>
+                          <m:endChr m:val=")"/>
+                          <m:grow/>
+                        </m:dPr>
+                        <m:e>
+                          <m:sSub>
+                            <m:e>
+                              <m:r>
+                                <m:t>y</m:t>
+                              </m:r>
+                            </m:e>
+                            <m:sub>
+                              <m:r>
+                                <m:t>t</m:t>
+                              </m:r>
+                            </m:sub>
+                          </m:sSub>
+                          <m:r>
+                            <m:rPr>
+                              <m:sty m:val="p"/>
+                            </m:rPr>
+                            <m:t>−</m:t>
+                          </m:r>
+                          <m:sSubSup>
+                            <m:e>
+                              <m:acc>
+                                <m:accPr>
+                                  <m:chr m:val="̂"/>
+                                </m:accPr>
+                                <m:e>
+                                  <m:r>
+                                    <m:t>y</m:t>
+                                  </m:r>
+                                </m:e>
+                              </m:acc>
+                            </m:e>
+                            <m:sub>
+                              <m:r>
+                                <m:t>t</m:t>
+                              </m:r>
+                            </m:sub>
+                            <m:sup>
+                              <m:r>
+                                <m:rPr>
+                                  <m:sty m:val="p"/>
+                                </m:rPr>
+                                <m:t>(</m:t>
+                              </m:r>
+                              <m:r>
+                                <m:t>f</m:t>
+                              </m:r>
+                              <m:r>
+                                <m:rPr>
+                                  <m:sty m:val="p"/>
+                                </m:rPr>
+                                <m:t>,</m:t>
+                              </m:r>
+                              <m:r>
+                                <m:t>j</m:t>
+                              </m:r>
+                              <m:r>
+                                <m:rPr>
+                                  <m:sty m:val="p"/>
+                                </m:rPr>
+                                <m:t>)</m:t>
+                              </m:r>
+                            </m:sup>
+                          </m:sSubSup>
+                        </m:e>
+                      </m:d>
+                    </m:e>
+                    <m:sup>
+                      <m:r>
+                        <m:t>2</m:t>
+                      </m:r>
+                    </m:sup>
+                  </m:sSup>
+                </m:e>
+              </m:nary>
+            </m:e>
+          </m:rad>
+          <m:r>
+            <m:rPr>
+              <m:sty m:val="p"/>
+            </m:rPr>
+            <m:t>,</m:t>
+          </m:r>
+          <m:r>
+            <m:t>  </m:t>
+          </m:r>
+          <m:r>
+            <m:rPr>
+              <m:nor/>
+              <m:sty m:val="p"/>
+            </m:rPr>
+            <m:t>reported as </m:t>
+          </m:r>
+          <m:r>
+            <m:t>100</m:t>
+          </m:r>
+          <m:r>
+            <m:t> </m:t>
+          </m:r>
+          <m:f>
+            <m:fPr>
+              <m:type m:val="bar"/>
+            </m:fPr>
+            <m:num>
+              <m:bar>
+                <m:barPr>
+                  <m:pos m:val="top"/>
+                </m:barPr>
+                <m:e>
+                  <m:sSub>
+                    <m:e>
+                      <m:r>
+                        <m:rPr>
+                          <m:sty m:val="p"/>
+                        </m:rPr>
+                        <m:t>R</m:t>
+                      </m:r>
+                      <m:r>
+                        <m:rPr>
+                          <m:sty m:val="p"/>
+                        </m:rPr>
+                        <m:t>M</m:t>
+                      </m:r>
+                      <m:r>
+                        <m:rPr>
+                          <m:sty m:val="p"/>
+                        </m:rPr>
+                        <m:t>S</m:t>
+                      </m:r>
+                      <m:r>
+                        <m:rPr>
+                          <m:sty m:val="p"/>
+                        </m:rPr>
+                        <m:t>E</m:t>
+                      </m:r>
+                    </m:e>
+                    <m:sub>
+                      <m:r>
+                        <m:t>f</m:t>
+                      </m:r>
+                    </m:sub>
+                  </m:sSub>
+                </m:e>
+              </m:bar>
+            </m:num>
+            <m:den>
+              <m:acc>
+                <m:accPr>
+                  <m:chr m:val="‾"/>
+                </m:accPr>
+                <m:e>
+                  <m:r>
+                    <m:t>y</m:t>
+                  </m:r>
+                </m:e>
+              </m:acc>
+            </m:den>
+          </m:f>
+          <m:r>
+            <m:t> </m:t>
+          </m:r>
+          <m:r>
+            <m:rPr>
+              <m:nor/>
+              <m:sty m:val="p"/>
+            </m:rPr>
+            <m:t>percent of the mean.</m:t>
+          </m:r>
+        </m:oMath>
+      </m:oMathPara>
+    </w:p>
+    <w:p>
+      <w:pPr>
+        <w:pStyle w:val="FirstParagraph"/>
+      </w:pPr>
+      <w:r>
+        <w:rPr>
+          <w:b/>
+          <w:bCs/>
+        </w:rPr>
+        <w:t xml:space="preserve">4. Chloride flux and thermal discharge.</w:t>
+      </w:r>
+      <w:r>
+        <w:t xml:space="preserve"> </w:t>
+      </w:r>
+      <w:r>
+        <w:t xml:space="preserve">With discharge</w:t>
+      </w:r>
+      <w:r>
+        <w:t xml:space="preserve"> </w:t>
+      </w:r>
+      <m:oMath>
+        <m:r>
+          <m:t>Q</m:t>
+        </m:r>
+      </m:oMath>
+      <w:r>
+        <w:t xml:space="preserve"> </w:t>
+      </w:r>
+      <w:r>
+        <w:t xml:space="preserve">and concentration</w:t>
+      </w:r>
+      <w:r>
+        <w:t xml:space="preserve"> </w:t>
+      </w:r>
+      <m:oMath>
+        <m:r>
+          <m:t>C</m:t>
+        </m:r>
+      </m:oMath>
+      <w:r>
+        <w:t xml:space="preserve">, chloride mass flux is the integral of</w:t>
+      </w:r>
+      <w:r>
+        <w:t xml:space="preserve"> </w:t>
+      </w:r>
+      <m:oMath>
+        <m:r>
+          <m:t>C</m:t>
+        </m:r>
+        <m:r>
+          <m:t> </m:t>
+        </m:r>
+        <m:r>
+          <m:t>Q</m:t>
+        </m:r>
+      </m:oMath>
+      <w:r>
+        <w:t xml:space="preserve">, computed by the trapezoid rule; the thermal-water inflow between SBRR (upstream) and SBBV (downstream) uses an end-member chloride</w:t>
+      </w:r>
+      <w:r>
+        <w:t xml:space="preserve"> </w:t>
+      </w:r>
+      <m:oMath>
+        <m:sSub>
+          <m:e>
+            <m:r>
+              <m:t>C</m:t>
+            </m:r>
+          </m:e>
+          <m:sub>
+            <m:r>
+              <m:t>T</m:t>
+            </m:r>
+            <m:r>
+              <m:t>W</m:t>
+            </m:r>
+          </m:sub>
+        </m:sSub>
+        <m:r>
+          <m:rPr>
+            <m:sty m:val="p"/>
+          </m:rPr>
+          <m:t>=</m:t>
+        </m:r>
+        <m:r>
+          <m:t>820</m:t>
+        </m:r>
+      </m:oMath>
+      <w:r>
+        <w:t xml:space="preserve"> </w:t>
+      </w:r>
+      <w:r>
+        <w:t xml:space="preserve">mg/L (Sorey and Colvard 1992):</w:t>
+      </w:r>
+    </w:p>
+    <w:p>
+      <w:pPr>
+        <w:pStyle w:val="BodyText"/>
+      </w:pPr>
+      <m:oMathPara>
+        <m:oMathParaPr>
+          <m:jc m:val="center"/>
+        </m:oMathParaPr>
+        <m:oMath>
+          <m:r>
+            <m:t>M</m:t>
+          </m:r>
+          <m:r>
+            <m:rPr>
+              <m:sty m:val="p"/>
+            </m:rPr>
+            <m:t>=</m:t>
+          </m:r>
+          <m:r>
+            <m:rPr>
+              <m:sty m:val="p"/>
+            </m:rPr>
+            <m:t>∫</m:t>
+          </m:r>
+          <m:r>
+            <m:t>C</m:t>
+          </m:r>
+          <m:r>
+            <m:rPr>
+              <m:sty m:val="p"/>
+            </m:rPr>
+            <m:t>(</m:t>
+          </m:r>
+          <m:r>
+            <m:t>t</m:t>
+          </m:r>
+          <m:r>
+            <m:rPr>
+              <m:sty m:val="p"/>
+            </m:rPr>
+            <m:t>)</m:t>
+          </m:r>
+          <m:r>
+            <m:t> </m:t>
+          </m:r>
+          <m:r>
+            <m:t>Q</m:t>
+          </m:r>
+          <m:r>
+            <m:rPr>
+              <m:sty m:val="p"/>
+            </m:rPr>
+            <m:t>(</m:t>
+          </m:r>
+          <m:r>
+            <m:t>t</m:t>
+          </m:r>
+          <m:r>
+            <m:rPr>
+              <m:sty m:val="p"/>
+            </m:rPr>
+            <m:t>)</m:t>
+          </m:r>
+          <m:r>
+            <m:t> </m:t>
+          </m:r>
+          <m:r>
+            <m:t>d</m:t>
+          </m:r>
+          <m:r>
+            <m:t>t</m:t>
+          </m:r>
+          <m:r>
+            <m:rPr>
+              <m:sty m:val="p"/>
+            </m:rPr>
+            <m:t>,</m:t>
+          </m:r>
+          <m:r>
+            <m:t>  </m:t>
+          </m:r>
+          <m:sSub>
+            <m:e>
+              <m:r>
+                <m:t>Q</m:t>
+              </m:r>
+            </m:e>
+            <m:sub>
+              <m:r>
+                <m:t>T</m:t>
+              </m:r>
+              <m:r>
+                <m:t>W</m:t>
+              </m:r>
+            </m:sub>
+          </m:sSub>
+          <m:r>
+            <m:rPr>
+              <m:sty m:val="p"/>
+            </m:rPr>
+            <m:t>=</m:t>
+          </m:r>
+          <m:f>
+            <m:fPr>
+              <m:type m:val="bar"/>
+            </m:fPr>
+            <m:num>
+              <m:sSub>
+                <m:e>
+                  <m:r>
+                    <m:t>Q</m:t>
+                  </m:r>
+                </m:e>
+                <m:sub>
+                  <m:r>
+                    <m:t>B</m:t>
+                  </m:r>
+                  <m:r>
+                    <m:t>V</m:t>
+                  </m:r>
+                </m:sub>
+              </m:sSub>
+              <m:r>
+                <m:t> </m:t>
+              </m:r>
+              <m:sSub>
+                <m:e>
+                  <m:r>
+                    <m:t>C</m:t>
+                  </m:r>
+                </m:e>
+                <m:sub>
+                  <m:r>
+                    <m:t>B</m:t>
+                  </m:r>
+                  <m:r>
+                    <m:t>V</m:t>
+                  </m:r>
+                </m:sub>
+              </m:sSub>
+              <m:r>
+                <m:rPr>
+                  <m:sty m:val="p"/>
+                </m:rPr>
+                <m:t>−</m:t>
+              </m:r>
+              <m:sSub>
+                <m:e>
+                  <m:r>
+                    <m:t>Q</m:t>
+                  </m:r>
+                </m:e>
+                <m:sub>
+                  <m:r>
+                    <m:t>R</m:t>
+                  </m:r>
+                  <m:r>
+                    <m:t>R</m:t>
+                  </m:r>
+                </m:sub>
+              </m:sSub>
+              <m:r>
+                <m:t> </m:t>
+              </m:r>
+              <m:sSub>
+                <m:e>
+                  <m:r>
+                    <m:t>C</m:t>
+                  </m:r>
+                </m:e>
+                <m:sub>
+                  <m:r>
+                    <m:t>R</m:t>
+                  </m:r>
+                  <m:r>
+                    <m:t>R</m:t>
+                  </m:r>
+                </m:sub>
+              </m:sSub>
+            </m:num>
+            <m:den>
+              <m:sSub>
+                <m:e>
+                  <m:r>
+                    <m:t>C</m:t>
+                  </m:r>
+                </m:e>
+                <m:sub>
+                  <m:r>
+                    <m:t>T</m:t>
+                  </m:r>
+                  <m:r>
+                    <m:t>W</m:t>
+                  </m:r>
+                </m:sub>
+              </m:sSub>
+            </m:den>
+          </m:f>
+        </m:oMath>
+      </m:oMathPara>
+    </w:p>
+    <w:bookmarkEnd w:id="12"/>
+    <w:bookmarkStart w:id="23" w:name="X9ead5809ab53723775592239fd4a6031d9ba468"/>
+    <w:p>
+      <w:pPr>
+        <w:pStyle w:val="Heading2"/>
+      </w:pPr>
+      <w:r>
+        <w:t xml:space="preserve">Conductivity record and the data each analysis uses</w:t>
+      </w:r>
+    </w:p>
+    <w:tbl>
+      <w:tblPr>
+        <w:tblStyle w:val="Table"/>
+        <w:tblW w:type="pct" w:w="5000"/>
+        <w:tblLayout w:type="fixed"/>
+        <w:tblLook w:firstRow="0" w:lastRow="0" w:firstColumn="0" w:lastColumn="0" w:noHBand="0" w:noVBand="0" w:val="0000"/>
+      </w:tblPr>
+      <w:tblGrid>
+        <w:gridCol w:w="7920"/>
+      </w:tblGrid>
+      <w:tr>
+        <w:tc>
+          <w:tcPr/>
+          <w:bookmarkStart w:id="17" w:name="fig-record"/>
+          <w:p>
+            <w:pPr>
+              <w:pStyle w:val="Compact"/>
+              <w:jc w:val="center"/>
+            </w:pPr>
+            <w:bookmarkStart w:id="16" w:name="fig-record"/>
+            <w:r>
+              <w:drawing>
+                <wp:inline>
+                  <wp:extent cx="5334000" cy="2963333"/>
+                  <wp:effectExtent b="0" l="0" r="0" t="0"/>
+                  <wp:docPr descr="" title="" id="14" name="Picture"/>
+                  <a:graphic>
+                    <a:graphicData uri="http://schemas.openxmlformats.org/drawingml/2006/picture">
+                      <pic:pic>
+                        <pic:nvPicPr>
+                          <pic:cNvPr descr="sampling_plan_costs_files/figure-docx/fig-record-1.png" id="15" name="Picture"/>
+                          <pic:cNvPicPr>
+                            <a:picLocks noChangeArrowheads="1" noChangeAspect="1"/>
+                          </pic:cNvPicPr>
+                        </pic:nvPicPr>
+                        <pic:blipFill>
+                          <a:blip r:embed="rId13"/>
+                          <a:stretch>
+                            <a:fillRect/>
+                          </a:stretch>
+                        </pic:blipFill>
+                        <pic:spPr bwMode="auto">
+                          <a:xfrm>
+                            <a:off x="0" y="0"/>
+                            <a:ext cx="5334000" cy="2963333"/>
+                          </a:xfrm>
+                          <a:prstGeom prst="rect">
+                            <a:avLst/>
+                          </a:prstGeom>
+                          <a:noFill/>
+                          <a:ln w="9525">
+                            <a:noFill/>
+                            <a:headEnd/>
+                            <a:tailEnd/>
+                          </a:ln>
+                        </pic:spPr>
+                      </pic:pic>
+                    </a:graphicData>
+                  </a:graphic>
+                </wp:inline>
+              </w:drawing>
+            </w:r>
+            <w:bookmarkEnd w:id="16"/>
+          </w:p>
+          <w:p>
+            <w:pPr>
+              <w:jc w:val="center"/>
+            </w:pPr>
+            <w:pPr>
+              <w:jc w:val="left"/>
+              <w:spacing w:before="200"/>
+              <w:pStyle w:val="ImageCaption"/>
+            </w:pPr>
+            <w:r>
+              <w:t xml:space="preserve">Figure 1</w:t>
+            </w:r>
+          </w:p>
+          <w:bookmarkEnd w:id="17"/>
+        </w:tc>
+      </w:tr>
+    </w:tbl>
+    <w:tbl>
+      <w:tblPr>
+        <w:tblStyle w:val="Table"/>
+        <w:tblW w:type="pct" w:w="5000"/>
+        <w:tblLayout w:type="fixed"/>
+        <w:tblLook w:firstRow="0" w:lastRow="0" w:firstColumn="0" w:lastColumn="0" w:noHBand="0" w:noVBand="0" w:val="0000"/>
+      </w:tblPr>
+      <w:tblGrid>
+        <w:gridCol w:w="7920"/>
+      </w:tblGrid>
+      <w:tr>
+        <w:tc>
+          <w:tcPr/>
+          <w:bookmarkStart w:id="22" w:name="fig-pairs"/>
+          <w:p>
+            <w:pPr>
+              <w:pStyle w:val="Compact"/>
+              <w:jc w:val="center"/>
+            </w:pPr>
+            <w:bookmarkStart w:id="21" w:name="fig-pairs"/>
+            <w:r>
+              <w:drawing>
+                <wp:inline>
+                  <wp:extent cx="5334000" cy="3048000"/>
+                  <wp:effectExtent b="0" l="0" r="0" t="0"/>
+                  <wp:docPr descr="" title="" id="19" name="Picture"/>
+                  <a:graphic>
+                    <a:graphicData uri="http://schemas.openxmlformats.org/drawingml/2006/picture">
+                      <pic:pic>
+                        <pic:nvPicPr>
+                          <pic:cNvPr descr="sampling_plan_costs_files/figure-docx/fig-pairs-1.png" id="20" name="Picture"/>
+                          <pic:cNvPicPr>
+                            <a:picLocks noChangeArrowheads="1" noChangeAspect="1"/>
+                          </pic:cNvPicPr>
+                        </pic:nvPicPr>
+                        <pic:blipFill>
+                          <a:blip r:embed="rId18"/>
+                          <a:stretch>
+                            <a:fillRect/>
+                          </a:stretch>
+                        </pic:blipFill>
+                        <pic:spPr bwMode="auto">
+                          <a:xfrm>
+                            <a:off x="0" y="0"/>
+                            <a:ext cx="5334000" cy="3048000"/>
+                          </a:xfrm>
+                          <a:prstGeom prst="rect">
+                            <a:avLst/>
+                          </a:prstGeom>
+                          <a:noFill/>
+                          <a:ln w="9525">
+                            <a:noFill/>
+                            <a:headEnd/>
+                            <a:tailEnd/>
+                          </a:ln>
+                        </pic:spPr>
+                      </pic:pic>
+                    </a:graphicData>
+                  </a:graphic>
+                </wp:inline>
+              </w:drawing>
+            </w:r>
+            <w:bookmarkEnd w:id="21"/>
+          </w:p>
+          <w:p>
+            <w:pPr>
+              <w:jc w:val="center"/>
+            </w:pPr>
+            <w:pPr>
+              <w:jc w:val="left"/>
+              <w:spacing w:before="200"/>
+              <w:pStyle w:val="ImageCaption"/>
+            </w:pPr>
+            <w:r>
+              <w:t xml:space="preserve">Figure 2</w:t>
+            </w:r>
+          </w:p>
+          <w:bookmarkEnd w:id="22"/>
+        </w:tc>
+      </w:tr>
+    </w:tbl>
+    <w:bookmarkEnd w:id="23"/>
+    <w:bookmarkStart w:id="27" w:name="X56231994a06b790aec90aa74882ec85db65ab16"/>
+    <w:p>
+      <w:pPr>
+        <w:pStyle w:val="Heading2"/>
+      </w:pPr>
+      <w:r>
+        <w:t xml:space="preserve">Why the proposed sampling interval matters: error grows with days between samples</w:t>
+      </w:r>
+    </w:p>
+    <w:p>
+      <w:pPr>
+        <w:pStyle w:val="CaptionedFigure"/>
+      </w:pPr>
+      <w:r>
+        <w:drawing>
+          <wp:inline>
+            <wp:extent cx="5334000" cy="3333750"/>
+            <wp:effectExtent b="0" l="0" r="0" t="0"/>
+            <wp:docPr descr="Reconstruction error of the conductance record against the candidate interval between samples, SBRR and SBGG (200 random start days per interval, QC-flagged readings excluded). Error rises from about 3-4% of mean conductance with daily samples to about 8-9% at 14 days; a longer interval is cheaper but leaves a larger error in the calibrated record." title="" id="25" name="Picture"/>
+            <a:graphic>
+              <a:graphicData uri="http://schemas.openxmlformats.org/drawingml/2006/picture">
+                <pic:pic>
+                  <pic:nvPicPr>
+                    <pic:cNvPr descr="C:/Projects/Steamboat/Steamboat_Geochemistry_Database/output/figures/manuscript/sampling_frequency_error_curve.png" id="26" name="Picture"/>
+                    <pic:cNvPicPr>
+                      <a:picLocks noChangeArrowheads="1" noChangeAspect="1"/>
+                    </pic:cNvPicPr>
+                  </pic:nvPicPr>
+                  <pic:blipFill>
+                    <a:blip r:embed="rId24"/>
+                    <a:stretch>
+                      <a:fillRect/>
+                    </a:stretch>
+                  </pic:blipFill>
+                  <pic:spPr bwMode="auto">
+                    <a:xfrm>
+                      <a:off x="0" y="0"/>
+                      <a:ext cx="5334000" cy="3333750"/>
+                    </a:xfrm>
+                    <a:prstGeom prst="rect">
+                      <a:avLst/>
+                    </a:prstGeom>
+                    <a:noFill/>
+                    <a:ln w="9525">
+                      <a:noFill/>
+                      <a:headEnd/>
+                      <a:tailEnd/>
+                    </a:ln>
+                  </pic:spPr>
+                </pic:pic>
+              </a:graphicData>
+            </a:graphic>
+          </wp:inline>
+        </w:drawing>
+      </w:r>
+    </w:p>
+    <w:p>
+      <w:pPr>
+        <w:pStyle w:val="ImageCaption"/>
+      </w:pPr>
+      <w:r>
+        <w:t xml:space="preserve">Reconstruction error of the conductance record against the candidate interval between samples, SBRR and SBGG (200 random start days per interval, QC-flagged readings excluded). Error rises from about 3-4% of mean conductance with daily samples to about 8-9% at 14 days; a longer interval is cheaper but leaves a larger error in the calibrated record.</w:t>
+      </w:r>
+    </w:p>
+    <w:bookmarkEnd w:id="27"/>
     <w:sectPr>
       <w:footnotePr>
         <w:numRestart w:val="eachSect"/>

</xml_diff>

<commit_message>
Re-run Monte Carlo sampling test excluding open-air days; state GAM ran on synthetic data; add PHREEQC limits paragraph
</commit_message>
<xml_diff>
--- a/docs/outreach/sampling_plan_costs.docx
+++ b/docs/outreach/sampling_plan_costs.docx
@@ -96,7 +96,7 @@
         <w:t xml:space="preserve"> </w:t>
       </w:r>
       <w:r>
-        <w:t xml:space="preserve">a Monte Carlo test on the logger record shows daily sampling keeps reconstruction error near 5%, while biweekly sampling costs 6-13% depending on the start day, so a short intensive window followed by monthly samples across a full year captures both fast variability and seasonal stability.</w:t>
+        <w:t xml:space="preserve">a Monte Carlo test on the real logger record (with the days the loggers sat in open air removed) shows daily sampling gives a reconstruction error of about 3-4% of mean conductance, while biweekly sampling gives about 8-10%, and 7-13% depending on the start day, so a short intensive window followed by monthly samples across a full year captures both fast variability and seasonal stability.</w:t>
       </w:r>
       <w:r>
         <w:t xml:space="preserve"> </w:t>
@@ -3314,7 +3314,7 @@
             <w:r>
               <w:drawing>
                 <wp:inline>
-                  <wp:extent cx="5334000" cy="2963333"/>
+                  <wp:extent cx="5334000" cy="3259666"/>
                   <wp:effectExtent b="0" l="0" r="0" t="0"/>
                   <wp:docPr descr="" title="" id="14" name="Picture"/>
                   <a:graphic>
@@ -3335,7 +3335,7 @@
                         <pic:spPr bwMode="auto">
                           <a:xfrm>
                             <a:off x="0" y="0"/>
-                            <a:ext cx="5334000" cy="2963333"/>
+                            <a:ext cx="5334000" cy="3259666"/>
                           </a:xfrm>
                           <a:prstGeom prst="rect">
                             <a:avLst/>
@@ -3472,7 +3472,7 @@
           <wp:inline>
             <wp:extent cx="5334000" cy="3333750"/>
             <wp:effectExtent b="0" l="0" r="0" t="0"/>
-            <wp:docPr descr="Reconstruction error of the conductance record against the candidate interval between samples, SBRR and SBGG (200 random start days per interval, QC-flagged readings excluded). Error rises from about 3-4% of mean conductance with daily samples to about 8-9% at 14 days; a longer interval is cheaper but leaves a larger error in the calibrated record." title="" id="25" name="Picture"/>
+            <wp:docPr descr="Reconstruction error of the conductance record against the candidate interval between samples, SBRR and SBGG (200 random start days per interval; QC-flagged readings, open-air days before retrieval, and SBGG after 2026-09-29 excluded). Mean error rises from about 3-4% of mean conductance with daily samples to about 8-10% at 14 days." title="" id="25" name="Picture"/>
             <a:graphic>
               <a:graphicData uri="http://schemas.openxmlformats.org/drawingml/2006/picture">
                 <pic:pic>
@@ -3515,10 +3515,471 @@
         <w:pStyle w:val="ImageCaption"/>
       </w:pPr>
       <w:r>
-        <w:t xml:space="preserve">Reconstruction error of the conductance record against the candidate interval between samples, SBRR and SBGG (200 random start days per interval, QC-flagged readings excluded). Error rises from about 3-4% of mean conductance with daily samples to about 8-9% at 14 days; a longer interval is cheaper but leaves a larger error in the calibrated record.</w:t>
+        <w:t xml:space="preserve">Reconstruction error of the conductance record against the candidate interval between samples, SBRR and SBGG (200 random start days per interval; QC-flagged readings, open-air days before retrieval, and SBGG after 2026-09-29 excluded). Mean error rises from about 3-4% of mean conductance with daily samples to about 8-10% at 14 days.</w:t>
       </w:r>
     </w:p>
     <w:bookmarkEnd w:id="27"/>
+    <w:bookmarkStart w:id="28" w:name="what-the-gam-has-and-has-not-been-run-on"/>
+    <w:p>
+      <w:pPr>
+        <w:pStyle w:val="Heading2"/>
+      </w:pPr>
+      <w:r>
+        <w:t xml:space="preserve">What the GAM has and has not been run on</w:t>
+      </w:r>
+    </w:p>
+    <w:p>
+      <w:pPr>
+        <w:pStyle w:val="FirstParagraph"/>
+      </w:pPr>
+      <w:r>
+        <w:t xml:space="preserve">The sampling interval in this plan comes from the Monte Carlo test on the</w:t>
+      </w:r>
+      <w:r>
+        <w:t xml:space="preserve"> </w:t>
+      </w:r>
+      <w:r>
+        <w:rPr>
+          <w:b/>
+          <w:bCs/>
+        </w:rPr>
+        <w:t xml:space="preserve">real</w:t>
+      </w:r>
+      <w:r>
+        <w:t xml:space="preserve"> </w:t>
+      </w:r>
+      <w:r>
+        <w:t xml:space="preserve">logger record (Figures 1 and 3). The chloride models themselves, including the GAM, have</w:t>
+      </w:r>
+      <w:r>
+        <w:t xml:space="preserve"> </w:t>
+      </w:r>
+      <w:r>
+        <w:rPr>
+          <w:b/>
+          <w:bCs/>
+        </w:rPr>
+        <w:t xml:space="preserve">not</w:t>
+      </w:r>
+      <w:r>
+        <w:t xml:space="preserve"> </w:t>
+      </w:r>
+      <w:r>
+        <w:t xml:space="preserve">been fitted to real paired data, because no chloride sample yet overlaps the logger record (zero pairs). They have been run only as a code test on a simulated data set (</w:t>
+      </w:r>
+      <w:r>
+        <w:rPr>
+          <w:rStyle w:val="VerbatimChar"/>
+        </w:rPr>
+        <w:t xml:space="preserve">simulate_synthetic_pairs()</w:t>
+      </w:r>
+      <w:r>
+        <w:t xml:space="preserve"> </w:t>
+      </w:r>
+      <w:r>
+        <w:t xml:space="preserve">in</w:t>
+      </w:r>
+      <w:r>
+        <w:t xml:space="preserve"> </w:t>
+      </w:r>
+      <w:r>
+        <w:rPr>
+          <w:rStyle w:val="VerbatimChar"/>
+        </w:rPr>
+        <w:t xml:space="preserve">03_chloride_models.R</w:t>
+      </w:r>
+      <w:r>
+        <w:t xml:space="preserve">): 60 samples every three days from 1 May 2026, with</w:t>
+      </w:r>
+    </w:p>
+    <w:p>
+      <w:pPr>
+        <w:pStyle w:val="BodyText"/>
+      </w:pPr>
+      <m:oMathPara>
+        <m:oMathParaPr>
+          <m:jc m:val="center"/>
+        </m:oMathParaPr>
+        <m:oMath>
+          <m:r>
+            <m:t>S</m:t>
+          </m:r>
+          <m:r>
+            <m:t>C</m:t>
+          </m:r>
+          <m:r>
+            <m:rPr>
+              <m:sty m:val="p"/>
+            </m:rPr>
+            <m:t>=</m:t>
+          </m:r>
+          <m:r>
+            <m:t>300</m:t>
+          </m:r>
+          <m:r>
+            <m:rPr>
+              <m:sty m:val="p"/>
+            </m:rPr>
+            <m:t>+</m:t>
+          </m:r>
+          <m:r>
+            <m:t>40</m:t>
+          </m:r>
+          <m:r>
+            <m:rPr>
+              <m:sty m:val="p"/>
+            </m:rPr>
+            <m:t>sin</m:t>
+          </m:r>
+          <m:r>
+            <m:t>​</m:t>
+          </m:r>
+          <m:d>
+            <m:dPr>
+              <m:begChr m:val="("/>
+              <m:sepChr m:val=""/>
+              <m:endChr m:val=")"/>
+              <m:grow/>
+            </m:dPr>
+            <m:e>
+              <m:f>
+                <m:fPr>
+                  <m:type m:val="lin"/>
+                </m:fPr>
+                <m:num>
+                  <m:r>
+                    <m:t>2</m:t>
+                  </m:r>
+                  <m:r>
+                    <m:t>π</m:t>
+                  </m:r>
+                  <m:r>
+                    <m:t>d</m:t>
+                  </m:r>
+                </m:num>
+                <m:den>
+                  <m:r>
+                    <m:t>365</m:t>
+                  </m:r>
+                </m:den>
+              </m:f>
+            </m:e>
+          </m:d>
+          <m:r>
+            <m:rPr>
+              <m:sty m:val="p"/>
+            </m:rPr>
+            <m:t>+</m:t>
+          </m:r>
+          <m:r>
+            <m:rPr>
+              <m:sty m:val="p"/>
+            </m:rPr>
+            <m:t>N</m:t>
+          </m:r>
+          <m:r>
+            <m:rPr>
+              <m:sty m:val="p"/>
+            </m:rPr>
+            <m:t>(</m:t>
+          </m:r>
+          <m:r>
+            <m:t>0</m:t>
+          </m:r>
+          <m:r>
+            <m:rPr>
+              <m:sty m:val="p"/>
+            </m:rPr>
+            <m:t>,</m:t>
+          </m:r>
+          <m:r>
+            <m:t>15</m:t>
+          </m:r>
+          <m:r>
+            <m:rPr>
+              <m:sty m:val="p"/>
+            </m:rPr>
+            <m:t>)</m:t>
+          </m:r>
+          <m:r>
+            <m:rPr>
+              <m:sty m:val="p"/>
+            </m:rPr>
+            <m:t>,</m:t>
+          </m:r>
+          <m:r>
+            <m:t> </m:t>
+          </m:r>
+          <m:r>
+            <m:t>T</m:t>
+          </m:r>
+          <m:r>
+            <m:rPr>
+              <m:sty m:val="p"/>
+            </m:rPr>
+            <m:t>=</m:t>
+          </m:r>
+          <m:r>
+            <m:t>15</m:t>
+          </m:r>
+          <m:r>
+            <m:rPr>
+              <m:sty m:val="p"/>
+            </m:rPr>
+            <m:t>+</m:t>
+          </m:r>
+          <m:r>
+            <m:t>8</m:t>
+          </m:r>
+          <m:r>
+            <m:rPr>
+              <m:sty m:val="p"/>
+            </m:rPr>
+            <m:t>sin</m:t>
+          </m:r>
+          <m:r>
+            <m:t>​</m:t>
+          </m:r>
+          <m:d>
+            <m:dPr>
+              <m:begChr m:val="("/>
+              <m:sepChr m:val=""/>
+              <m:endChr m:val=")"/>
+              <m:grow/>
+            </m:dPr>
+            <m:e>
+              <m:f>
+                <m:fPr>
+                  <m:type m:val="lin"/>
+                </m:fPr>
+                <m:num>
+                  <m:r>
+                    <m:t>2</m:t>
+                  </m:r>
+                  <m:r>
+                    <m:t>π</m:t>
+                  </m:r>
+                  <m:r>
+                    <m:rPr>
+                      <m:sty m:val="p"/>
+                    </m:rPr>
+                    <m:t>(</m:t>
+                  </m:r>
+                  <m:r>
+                    <m:t>d</m:t>
+                  </m:r>
+                  <m:r>
+                    <m:rPr>
+                      <m:sty m:val="p"/>
+                    </m:rPr>
+                    <m:t>−</m:t>
+                  </m:r>
+                  <m:r>
+                    <m:t>60</m:t>
+                  </m:r>
+                  <m:r>
+                    <m:rPr>
+                      <m:sty m:val="p"/>
+                    </m:rPr>
+                    <m:t>)</m:t>
+                  </m:r>
+                </m:num>
+                <m:den>
+                  <m:r>
+                    <m:t>365</m:t>
+                  </m:r>
+                </m:den>
+              </m:f>
+            </m:e>
+          </m:d>
+          <m:r>
+            <m:rPr>
+              <m:sty m:val="p"/>
+            </m:rPr>
+            <m:t>+</m:t>
+          </m:r>
+          <m:r>
+            <m:rPr>
+              <m:sty m:val="p"/>
+            </m:rPr>
+            <m:t>N</m:t>
+          </m:r>
+          <m:r>
+            <m:rPr>
+              <m:sty m:val="p"/>
+            </m:rPr>
+            <m:t>(</m:t>
+          </m:r>
+          <m:r>
+            <m:t>0</m:t>
+          </m:r>
+          <m:r>
+            <m:rPr>
+              <m:sty m:val="p"/>
+            </m:rPr>
+            <m:t>,</m:t>
+          </m:r>
+          <m:r>
+            <m:t>1.5</m:t>
+          </m:r>
+          <m:r>
+            <m:rPr>
+              <m:sty m:val="p"/>
+            </m:rPr>
+            <m:t>)</m:t>
+          </m:r>
+          <m:r>
+            <m:rPr>
+              <m:sty m:val="p"/>
+            </m:rPr>
+            <m:t>,</m:t>
+          </m:r>
+        </m:oMath>
+      </m:oMathPara>
+    </w:p>
+    <w:p>
+      <w:pPr>
+        <w:pStyle w:val="FirstParagraph"/>
+      </w:pPr>
+      <m:oMathPara>
+        <m:oMathParaPr>
+          <m:jc m:val="center"/>
+        </m:oMathParaPr>
+        <m:oMath>
+          <m:r>
+            <m:rPr>
+              <m:sty m:val="p"/>
+            </m:rPr>
+            <m:t>C</m:t>
+          </m:r>
+          <m:r>
+            <m:rPr>
+              <m:sty m:val="p"/>
+            </m:rPr>
+            <m:t>l</m:t>
+          </m:r>
+          <m:r>
+            <m:rPr>
+              <m:sty m:val="p"/>
+            </m:rPr>
+            <m:t>=</m:t>
+          </m:r>
+          <m:r>
+            <m:t>1</m:t>
+          </m:r>
+          <m:r>
+            <m:rPr>
+              <m:sty m:val="p"/>
+            </m:rPr>
+            <m:t>+</m:t>
+          </m:r>
+          <m:r>
+            <m:t>0.071</m:t>
+          </m:r>
+          <m:r>
+            <m:t> </m:t>
+          </m:r>
+          <m:r>
+            <m:t>S</m:t>
+          </m:r>
+          <m:sSub>
+            <m:e>
+              <m:r>
+                <m:t>C</m:t>
+              </m:r>
+            </m:e>
+            <m:sub>
+              <m:r>
+                <m:rPr>
+                  <m:nor/>
+                  <m:sty m:val="p"/>
+                </m:rPr>
+                <m:t>lag</m:t>
+              </m:r>
+            </m:sub>
+          </m:sSub>
+          <m:r>
+            <m:rPr>
+              <m:sty m:val="p"/>
+            </m:rPr>
+            <m:t>+</m:t>
+          </m:r>
+          <m:r>
+            <m:t>0.1</m:t>
+          </m:r>
+          <m:r>
+            <m:t> </m:t>
+          </m:r>
+          <m:sSub>
+            <m:e>
+              <m:r>
+                <m:t>T</m:t>
+              </m:r>
+            </m:e>
+            <m:sub>
+              <m:r>
+                <m:rPr>
+                  <m:nor/>
+                  <m:sty m:val="p"/>
+                </m:rPr>
+                <m:t>lag</m:t>
+              </m:r>
+            </m:sub>
+          </m:sSub>
+          <m:r>
+            <m:rPr>
+              <m:sty m:val="p"/>
+            </m:rPr>
+            <m:t>+</m:t>
+          </m:r>
+          <m:r>
+            <m:rPr>
+              <m:sty m:val="p"/>
+            </m:rPr>
+            <m:t>N</m:t>
+          </m:r>
+          <m:r>
+            <m:rPr>
+              <m:sty m:val="p"/>
+            </m:rPr>
+            <m:t>(</m:t>
+          </m:r>
+          <m:r>
+            <m:t>0</m:t>
+          </m:r>
+          <m:r>
+            <m:rPr>
+              <m:sty m:val="p"/>
+            </m:rPr>
+            <m:t>,</m:t>
+          </m:r>
+          <m:r>
+            <m:t>1.5</m:t>
+          </m:r>
+          <m:r>
+            <m:rPr>
+              <m:sty m:val="p"/>
+            </m:rPr>
+            <m:t>)</m:t>
+          </m:r>
+          <m:r>
+            <m:rPr>
+              <m:sty m:val="p"/>
+            </m:rPr>
+            <m:t>,</m:t>
+          </m:r>
+        </m:oMath>
+      </m:oMathPara>
+    </w:p>
+    <w:p>
+      <w:pPr>
+        <w:pStyle w:val="FirstParagraph"/>
+      </w:pPr>
+      <w:r>
+        <w:t xml:space="preserve">where the lag is six days. The slope 0.071 comes from the single real SBRR pair (Cl 17.1 mg/L at 241 uS/cm on 2026-05-01), so the simulated chloride stays in a realistic range; every other value is made up. Because the data were generated from a known linear rule, the exercise shows only that the fitting and cross-validation code runs and recovers a known relationship. It does not show how well a GAM will perform on Steamboat Creek, and it did not influence the sampling interval. The only real fit is the linear regression on 181 historical NDEP pairs in Figure 2, which predates the loggers. The calibration samples proposed in this document supply the first real pairs for the GAM.</w:t>
+      </w:r>
+    </w:p>
+    <w:bookmarkEnd w:id="28"/>
     <w:sectPr>
       <w:footnotePr>
         <w:numRestart w:val="eachSect"/>

</xml_diff>